<commit_message>
paper mods - minor
</commit_message>
<xml_diff>
--- a/AT_CallForResearch.docx
+++ b/AT_CallForResearch.docx
@@ -147,7 +147,10 @@
         <w:divId w:val="1808039875"/>
       </w:pPr>
       <w:r>
-        <w:t>Over 40 years ago, Khoe</w:t>
+        <w:t>Nearly 50 years ago</w:t>
+      </w:r>
+      <w:r>
+        <w:t>, Khoe</w:t>
       </w:r>
       <w:r>
         <w:rPr>
@@ -159,13 +162,22 @@
         <w:t xml:space="preserve"> and then Amaro</w:t>
       </w:r>
       <w:r>
+        <w:t xml:space="preserve"> in 2001</w:t>
+      </w:r>
+      <w:r>
         <w:rPr>
           <w:vertAlign w:val="superscript"/>
         </w:rPr>
         <w:t>3</w:t>
       </w:r>
       <w:r>
-        <w:t xml:space="preserve"> postulated that stimulating horary points based on destination time zones during travel could help pre-synchronize organ systems to the destination time zone, targeting jet lag's circadian misalignment. Theory and anecdotal evidence say this works. Unfortunately, no studies have validated it. We aim to address that lack of evidence with an app that provides a destination based 24-hour schedule of acupuncture points for </w:t>
+        <w:t xml:space="preserve"> postulated that stimulating horary points based on destination time zones during travel could help pre-synchronize organ systems to the destination time zone, targeting jet lag's circadian misalignment. Theory and anecdotal evidence say this works. Unfortunately, no studies have validated it. We aim to address that lack of evidence with an app that provides a destination</w:t>
+      </w:r>
+      <w:r>
+        <w:t>-</w:t>
+      </w:r>
+      <w:r>
+        <w:t xml:space="preserve">based 24-hour schedule of acupuncture points for </w:t>
       </w:r>
       <w:r>
         <w:t>travelers to stimulate as they travel</w:t>
@@ -355,10 +367,16 @@
         <w:divId w:val="1808039875"/>
       </w:pPr>
       <w:r>
-        <w:t>We end up with j</w:t>
-      </w:r>
-      <w:r>
-        <w:t xml:space="preserve">et lag when rapid time zone changes desynchronize these </w:t>
+        <w:t>J</w:t>
+      </w:r>
+      <w:r>
+        <w:t xml:space="preserve">et lag </w:t>
+      </w:r>
+      <w:r>
+        <w:t xml:space="preserve">results </w:t>
+      </w:r>
+      <w:r>
+        <w:t xml:space="preserve">when rapid time zone changes desynchronize these </w:t>
       </w:r>
       <w:r>
         <w:t xml:space="preserve">internal </w:t>
@@ -402,9 +420,6 @@
           <w:vertAlign w:val="superscript"/>
         </w:rPr>
         <w:t>10</w:t>
-      </w:r>
-      <w:r>
-        <w:t>.</w:t>
       </w:r>
       <w:r>
         <w:t xml:space="preserve"> </w:t>
@@ -434,8 +449,8 @@
         </w:rPr>
         <w:lastRenderedPageBreak/>
         <w:drawing>
-          <wp:inline distT="0" distB="0" distL="0" distR="0" wp14:anchorId="4B27F818" wp14:editId="0213E518">
-            <wp:extent cx="3629025" cy="3629025"/>
+          <wp:inline distT="0" distB="0" distL="0" distR="0" wp14:anchorId="4B27F818" wp14:editId="10CD9128">
+            <wp:extent cx="3095625" cy="3095625"/>
             <wp:effectExtent l="0" t="0" r="9525" b="9525"/>
             <wp:docPr id="1" name="Picture 1"/>
             <wp:cNvGraphicFramePr>
@@ -463,7 +478,7 @@
                   <pic:spPr>
                     <a:xfrm>
                       <a:off x="0" y="0"/>
-                      <a:ext cx="3629025" cy="3629025"/>
+                      <a:ext cx="3095625" cy="3095625"/>
                     </a:xfrm>
                     <a:prstGeom prst="rect">
                       <a:avLst/>
@@ -2492,36 +2507,35 @@
           <w:b w:val="0"/>
           <w:bCs w:val="0"/>
         </w:rPr>
-        <w:t xml:space="preserve">Our solution was to use alternative channel points to replace “inaccessible” points </w:t>
+        <w:t xml:space="preserve">Our solution was to use alternative channel points to replace “inaccessible” points understanding that </w:t>
       </w:r>
       <w:r>
         <w:rPr>
           <w:b w:val="0"/>
           <w:bCs w:val="0"/>
         </w:rPr>
-        <w:lastRenderedPageBreak/>
-        <w:t xml:space="preserve">understanding that </w:t>
+        <w:t xml:space="preserve">it </w:t>
       </w:r>
       <w:r>
         <w:rPr>
           <w:b w:val="0"/>
           <w:bCs w:val="0"/>
         </w:rPr>
-        <w:t xml:space="preserve">it </w:t>
+        <w:t>would be</w:t>
       </w:r>
       <w:r>
         <w:rPr>
           <w:b w:val="0"/>
           <w:bCs w:val="0"/>
         </w:rPr>
-        <w:t>would be</w:t>
+        <w:t xml:space="preserve"> better to stimulate </w:t>
       </w:r>
       <w:r>
         <w:rPr>
           <w:b w:val="0"/>
           <w:bCs w:val="0"/>
         </w:rPr>
-        <w:t xml:space="preserve"> better to stimulate </w:t>
+        <w:t xml:space="preserve">the </w:t>
       </w:r>
       <w:r>
         <w:rPr>
@@ -2602,6 +2616,7 @@
           <w:b w:val="0"/>
           <w:bCs w:val="0"/>
         </w:rPr>
+        <w:lastRenderedPageBreak/>
         <w:t>For practicality and ease of location, w</w:t>
       </w:r>
       <w:r>
@@ -2616,7 +2631,21 @@
           <w:b w:val="0"/>
           <w:bCs w:val="0"/>
         </w:rPr>
-        <w:t>SP-10 (above the knee) for SP-3, BL-2 (inner eyebrow) for BL-66, GB-20 (back of head) for GB-41, LIV-8 (medial knee) for LIV-1, and KI-27 (upper chest) for KI-10. In TCM theory, any point on a meridian can affect the entire pathway and this substitution maintains meridian specificity.</w:t>
+        <w:t>SP-10 (above the knee) for SP-3, BL-2 (inner eyebrow) for BL-66, GB-20 (back of head) for GB-41, LIV-8 (medial knee) for LIV-1, and KI-27 (upper chest) for KI-10. In TCM theory, any point on a meridian can affect the entire pathway</w:t>
+      </w:r>
+      <w:r>
+        <w:rPr>
+          <w:b w:val="0"/>
+          <w:bCs w:val="0"/>
+        </w:rPr>
+        <w:t>,</w:t>
+      </w:r>
+      <w:r>
+        <w:rPr>
+          <w:b w:val="0"/>
+          <w:bCs w:val="0"/>
+        </w:rPr>
+        <w:t xml:space="preserve"> and this substitution maintains meridian specificity.</w:t>
       </w:r>
     </w:p>
     <w:p>
@@ -2746,7 +2775,13 @@
         <w:t xml:space="preserve">add-ons, upgrades or </w:t>
       </w:r>
       <w:r>
-        <w:t xml:space="preserve">advertisements. As an incentive, participants who use the app for a valid journey and complete the survey will enjoy free lifetime access. </w:t>
+        <w:t>advertisements. As an incentive, participants who use the app for a valid journey and complete the survey will enjoy free lifetime access</w:t>
+      </w:r>
+      <w:r>
+        <w:t xml:space="preserve"> when the app is officially released</w:t>
+      </w:r>
+      <w:r>
+        <w:t xml:space="preserve">. </w:t>
       </w:r>
     </w:p>
     <w:p>
@@ -2768,7 +2803,13 @@
         <w:t xml:space="preserve"> timing and instructions. </w:t>
       </w:r>
       <w:r>
-        <w:t>If you have questions, email info@jetlagpro.com.</w:t>
+        <w:t>If you have questions, email</w:t>
+      </w:r>
+      <w:r>
+        <w:t xml:space="preserve"> us</w:t>
+      </w:r>
+      <w:r>
+        <w:t xml:space="preserve"> info@jetlagpro.com.</w:t>
       </w:r>
     </w:p>
     <w:p>
@@ -2781,206 +2822,6 @@
         <w:divId w:val="1808039875"/>
       </w:pPr>
     </w:p>
-    <w:tbl>
-      <w:tblPr>
-        <w:tblStyle w:val="TableGrid"/>
-        <w:tblW w:w="0" w:type="auto"/>
-        <w:tblLook w:val="04A0" w:firstRow="1" w:lastRow="0" w:firstColumn="1" w:lastColumn="0" w:noHBand="0" w:noVBand="1"/>
-      </w:tblPr>
-      <w:tblGrid>
-        <w:gridCol w:w="3116"/>
-        <w:gridCol w:w="3117"/>
-        <w:gridCol w:w="3117"/>
-      </w:tblGrid>
-      <w:tr>
-        <w:tc>
-          <w:tcPr>
-            <w:tcW w:w="3116" w:type="dxa"/>
-          </w:tcPr>
-          <w:p>
-            <w:pPr>
-              <w:jc w:val="center"/>
-              <w:rPr>
-                <w:rFonts w:eastAsia="Times New Roman"/>
-                <w:color w:val="333333"/>
-              </w:rPr>
-            </w:pPr>
-            <w:r>
-              <w:rPr>
-                <w:rFonts w:eastAsia="Times New Roman"/>
-                <w:noProof/>
-                <w:color w:val="333333"/>
-              </w:rPr>
-              <w:drawing>
-                <wp:inline distT="0" distB="0" distL="0" distR="0" wp14:anchorId="698CDE87" wp14:editId="615F5AE5">
-                  <wp:extent cx="1685779" cy="3648075"/>
-                  <wp:effectExtent l="0" t="0" r="0" b="0"/>
-                  <wp:docPr id="14" name="Picture 14"/>
-                  <wp:cNvGraphicFramePr>
-                    <a:graphicFrameLocks xmlns:a="http://schemas.openxmlformats.org/drawingml/2006/main" noChangeAspect="1"/>
-                  </wp:cNvGraphicFramePr>
-                  <a:graphic xmlns:a="http://schemas.openxmlformats.org/drawingml/2006/main">
-                    <a:graphicData uri="http://schemas.openxmlformats.org/drawingml/2006/picture">
-                      <pic:pic xmlns:pic="http://schemas.openxmlformats.org/drawingml/2006/picture">
-                        <pic:nvPicPr>
-                          <pic:cNvPr id="14" name="Picture 14"/>
-                          <pic:cNvPicPr/>
-                        </pic:nvPicPr>
-                        <pic:blipFill>
-                          <a:blip r:embed="rId9" cstate="print">
-                            <a:extLst>
-                              <a:ext uri="{28A0092B-C50C-407E-A947-70E740481C1C}">
-                                <a14:useLocalDpi xmlns:a14="http://schemas.microsoft.com/office/drawing/2010/main" val="0"/>
-                              </a:ext>
-                            </a:extLst>
-                          </a:blip>
-                          <a:stretch>
-                            <a:fillRect/>
-                          </a:stretch>
-                        </pic:blipFill>
-                        <pic:spPr>
-                          <a:xfrm>
-                            <a:off x="0" y="0"/>
-                            <a:ext cx="1692160" cy="3661883"/>
-                          </a:xfrm>
-                          <a:prstGeom prst="rect">
-                            <a:avLst/>
-                          </a:prstGeom>
-                        </pic:spPr>
-                      </pic:pic>
-                    </a:graphicData>
-                  </a:graphic>
-                </wp:inline>
-              </w:drawing>
-            </w:r>
-          </w:p>
-        </w:tc>
-        <w:tc>
-          <w:tcPr>
-            <w:tcW w:w="3117" w:type="dxa"/>
-          </w:tcPr>
-          <w:p>
-            <w:pPr>
-              <w:jc w:val="center"/>
-              <w:rPr>
-                <w:rFonts w:eastAsia="Times New Roman"/>
-                <w:color w:val="333333"/>
-              </w:rPr>
-            </w:pPr>
-            <w:r>
-              <w:rPr>
-                <w:rFonts w:eastAsia="Times New Roman"/>
-                <w:noProof/>
-                <w:color w:val="333333"/>
-              </w:rPr>
-              <w:drawing>
-                <wp:inline distT="0" distB="0" distL="0" distR="0" wp14:anchorId="519031A9" wp14:editId="26F5FDA5">
-                  <wp:extent cx="1685779" cy="3648075"/>
-                  <wp:effectExtent l="0" t="0" r="0" b="0"/>
-                  <wp:docPr id="13" name="Picture 13"/>
-                  <wp:cNvGraphicFramePr>
-                    <a:graphicFrameLocks xmlns:a="http://schemas.openxmlformats.org/drawingml/2006/main" noChangeAspect="1"/>
-                  </wp:cNvGraphicFramePr>
-                  <a:graphic xmlns:a="http://schemas.openxmlformats.org/drawingml/2006/main">
-                    <a:graphicData uri="http://schemas.openxmlformats.org/drawingml/2006/picture">
-                      <pic:pic xmlns:pic="http://schemas.openxmlformats.org/drawingml/2006/picture">
-                        <pic:nvPicPr>
-                          <pic:cNvPr id="13" name="Picture 13"/>
-                          <pic:cNvPicPr/>
-                        </pic:nvPicPr>
-                        <pic:blipFill>
-                          <a:blip r:embed="rId10" cstate="print">
-                            <a:extLst>
-                              <a:ext uri="{28A0092B-C50C-407E-A947-70E740481C1C}">
-                                <a14:useLocalDpi xmlns:a14="http://schemas.microsoft.com/office/drawing/2010/main" val="0"/>
-                              </a:ext>
-                            </a:extLst>
-                          </a:blip>
-                          <a:stretch>
-                            <a:fillRect/>
-                          </a:stretch>
-                        </pic:blipFill>
-                        <pic:spPr>
-                          <a:xfrm>
-                            <a:off x="0" y="0"/>
-                            <a:ext cx="1694765" cy="3667520"/>
-                          </a:xfrm>
-                          <a:prstGeom prst="rect">
-                            <a:avLst/>
-                          </a:prstGeom>
-                        </pic:spPr>
-                      </pic:pic>
-                    </a:graphicData>
-                  </a:graphic>
-                </wp:inline>
-              </w:drawing>
-            </w:r>
-          </w:p>
-        </w:tc>
-        <w:tc>
-          <w:tcPr>
-            <w:tcW w:w="3117" w:type="dxa"/>
-          </w:tcPr>
-          <w:p>
-            <w:pPr>
-              <w:jc w:val="center"/>
-              <w:rPr>
-                <w:rFonts w:eastAsia="Times New Roman"/>
-                <w:color w:val="333333"/>
-              </w:rPr>
-            </w:pPr>
-            <w:r>
-              <w:rPr>
-                <w:rFonts w:eastAsia="Times New Roman"/>
-                <w:noProof/>
-                <w:color w:val="333333"/>
-              </w:rPr>
-              <w:drawing>
-                <wp:inline distT="0" distB="0" distL="0" distR="0" wp14:anchorId="77C74EAA" wp14:editId="4D5D1732">
-                  <wp:extent cx="1685780" cy="3648075"/>
-                  <wp:effectExtent l="0" t="0" r="0" b="0"/>
-                  <wp:docPr id="9" name="Picture 9"/>
-                  <wp:cNvGraphicFramePr>
-                    <a:graphicFrameLocks xmlns:a="http://schemas.openxmlformats.org/drawingml/2006/main" noChangeAspect="1"/>
-                  </wp:cNvGraphicFramePr>
-                  <a:graphic xmlns:a="http://schemas.openxmlformats.org/drawingml/2006/main">
-                    <a:graphicData uri="http://schemas.openxmlformats.org/drawingml/2006/picture">
-                      <pic:pic xmlns:pic="http://schemas.openxmlformats.org/drawingml/2006/picture">
-                        <pic:nvPicPr>
-                          <pic:cNvPr id="9" name="Picture 9"/>
-                          <pic:cNvPicPr/>
-                        </pic:nvPicPr>
-                        <pic:blipFill>
-                          <a:blip r:embed="rId11" cstate="print">
-                            <a:extLst>
-                              <a:ext uri="{28A0092B-C50C-407E-A947-70E740481C1C}">
-                                <a14:useLocalDpi xmlns:a14="http://schemas.microsoft.com/office/drawing/2010/main" val="0"/>
-                              </a:ext>
-                            </a:extLst>
-                          </a:blip>
-                          <a:stretch>
-                            <a:fillRect/>
-                          </a:stretch>
-                        </pic:blipFill>
-                        <pic:spPr>
-                          <a:xfrm>
-                            <a:off x="0" y="0"/>
-                            <a:ext cx="1700227" cy="3679339"/>
-                          </a:xfrm>
-                          <a:prstGeom prst="rect">
-                            <a:avLst/>
-                          </a:prstGeom>
-                        </pic:spPr>
-                      </pic:pic>
-                    </a:graphicData>
-                  </a:graphic>
-                </wp:inline>
-              </w:drawing>
-            </w:r>
-          </w:p>
-        </w:tc>
-      </w:tr>
-    </w:tbl>
     <w:p>
       <w:pPr>
         <w:jc w:val="center"/>
@@ -2989,26 +2830,80 @@
           <w:color w:val="333333"/>
         </w:rPr>
       </w:pPr>
+      <w:r>
+        <w:rPr>
+          <w:rFonts w:eastAsia="Times New Roman"/>
+          <w:noProof/>
+          <w:color w:val="333333"/>
+        </w:rPr>
+        <w:drawing>
+          <wp:inline distT="0" distB="0" distL="0" distR="0" wp14:anchorId="7E94C8E4" wp14:editId="64686011">
+            <wp:extent cx="5943600" cy="4138295"/>
+            <wp:effectExtent l="0" t="0" r="0" b="0"/>
+            <wp:docPr id="12" name="Picture 12"/>
+            <wp:cNvGraphicFramePr>
+              <a:graphicFrameLocks xmlns:a="http://schemas.openxmlformats.org/drawingml/2006/main" noChangeAspect="1"/>
+            </wp:cNvGraphicFramePr>
+            <a:graphic xmlns:a="http://schemas.openxmlformats.org/drawingml/2006/main">
+              <a:graphicData uri="http://schemas.openxmlformats.org/drawingml/2006/picture">
+                <pic:pic xmlns:pic="http://schemas.openxmlformats.org/drawingml/2006/picture">
+                  <pic:nvPicPr>
+                    <pic:cNvPr id="12" name="Picture 12"/>
+                    <pic:cNvPicPr/>
+                  </pic:nvPicPr>
+                  <pic:blipFill>
+                    <a:blip r:embed="rId9" cstate="print">
+                      <a:extLst>
+                        <a:ext uri="{28A0092B-C50C-407E-A947-70E740481C1C}">
+                          <a14:useLocalDpi xmlns:a14="http://schemas.microsoft.com/office/drawing/2010/main" val="0"/>
+                        </a:ext>
+                      </a:extLst>
+                    </a:blip>
+                    <a:stretch>
+                      <a:fillRect/>
+                    </a:stretch>
+                  </pic:blipFill>
+                  <pic:spPr>
+                    <a:xfrm>
+                      <a:off x="0" y="0"/>
+                      <a:ext cx="5943600" cy="4138295"/>
+                    </a:xfrm>
+                    <a:prstGeom prst="rect">
+                      <a:avLst/>
+                    </a:prstGeom>
+                  </pic:spPr>
+                </pic:pic>
+              </a:graphicData>
+            </a:graphic>
+          </wp:inline>
+        </w:drawing>
+      </w:r>
     </w:p>
     <w:p>
       <w:pPr>
         <w:jc w:val="center"/>
         <w:divId w:val="1808039875"/>
       </w:pPr>
-      <w:r>
-        <w:t>Figure 2 – The Three Steps</w:t>
-      </w:r>
     </w:p>
     <w:p>
       <w:pPr>
         <w:jc w:val="center"/>
         <w:divId w:val="1808039875"/>
       </w:pPr>
+      <w:r>
+        <w:t>Figure 2 – The Three Steps</w:t>
+      </w:r>
     </w:p>
     <w:p>
       <w:pPr>
+        <w:jc w:val="center"/>
         <w:divId w:val="1808039875"/>
       </w:pPr>
+    </w:p>
+    <w:p>
+      <w:pPr>
+        <w:divId w:val="1808039875"/>
+      </w:pPr>
       <w:r>
         <w:t xml:space="preserve">Scheduled reminders pop up </w:t>
       </w:r>
@@ -3034,17 +2929,20 @@
         <w:t xml:space="preserve">do the next point. </w:t>
       </w:r>
       <w:r>
-        <w:t xml:space="preserve">The reminders are persistent and remain on the user's phone (or </w:t>
-      </w:r>
-      <w:r>
-        <w:t>iW</w:t>
-      </w:r>
-      <w:r>
-        <w:t xml:space="preserve">atch) until clicked. When </w:t>
+        <w:t>The reminders are persistent and remain on the user's phone (or</w:t>
+      </w:r>
+      <w:r>
+        <w:t xml:space="preserve"> Apple </w:t>
+      </w:r>
+      <w:r>
+        <w:t>W</w:t>
+      </w:r>
+      <w:r>
+        <w:t xml:space="preserve">atch) until clicked. </w:t>
       </w:r>
       <w:r>
         <w:lastRenderedPageBreak/>
-        <w:t xml:space="preserve">clicked, the </w:t>
+        <w:t xml:space="preserve">When clicked, the </w:t>
       </w:r>
       <w:r>
         <w:t>traveler</w:t>
@@ -3088,7 +2986,7 @@
                     <pic:cNvPicPr/>
                   </pic:nvPicPr>
                   <pic:blipFill>
-                    <a:blip r:embed="rId12" cstate="print">
+                    <a:blip r:embed="rId10" cstate="print">
                       <a:extLst>
                         <a:ext uri="{28A0092B-C50C-407E-A947-70E740481C1C}">
                           <a14:useLocalDpi xmlns:a14="http://schemas.microsoft.com/office/drawing/2010/main" val="0"/>
@@ -3190,7 +3088,7 @@
         <w:t xml:space="preserve"> a survey reminder </w:t>
       </w:r>
       <w:r>
-        <w:t>is the schedul</w:t>
+        <w:t>is schedul</w:t>
       </w:r>
       <w:r>
         <w:t>ed</w:t>
@@ -3281,7 +3179,19 @@
         <w:t>grouped by the number of acupressure points</w:t>
       </w:r>
       <w:r>
-        <w:t xml:space="preserve"> along with time zones crossed</w:t>
+        <w:t xml:space="preserve"> </w:t>
+      </w:r>
+      <w:r>
+        <w:t xml:space="preserve">stimulated </w:t>
+      </w:r>
+      <w:r>
+        <w:t xml:space="preserve">along with </w:t>
+      </w:r>
+      <w:r>
+        <w:t xml:space="preserve">the number of </w:t>
+      </w:r>
+      <w:r>
+        <w:t>time zones crossed</w:t>
       </w:r>
       <w:r>
         <w:t>.</w:t>
@@ -3419,7 +3329,7 @@
       <w:r>
         <w:t xml:space="preserve">Waterhouse, J., Reilly, T., Atkinson, G., &amp; Edwards, B. (2007). Jet lag: Trends and coping strategies. The Lancet, 369(9567), 1117–1129. </w:t>
       </w:r>
-      <w:hyperlink r:id="rId13" w:tgtFrame="_blank" w:history="1">
+      <w:hyperlink r:id="rId11" w:tgtFrame="_blank" w:history="1">
         <w:r>
           <w:rPr>
             <w:rStyle w:val="Hyperlink"/>
@@ -3475,7 +3385,7 @@
         </w:rPr>
         <w:t xml:space="preserve">Amaro, J. (2001). Time Travel: Contemporary Applications for Jet Lag from Ancient Principles. Acupuncture Today, October 2001. </w:t>
       </w:r>
-      <w:hyperlink r:id="rId14" w:tgtFrame="_blank" w:history="1">
+      <w:hyperlink r:id="rId12" w:tgtFrame="_blank" w:history="1">
         <w:r>
           <w:rPr>
             <w:rStyle w:val="Hyperlink"/>
@@ -3505,39 +3415,14 @@
         </w:rPr>
         <w:t xml:space="preserve">Panda, S. (2022). Foundations of circadian medicine. </w:t>
       </w:r>
-      <w:proofErr w:type="spellStart"/>
       <w:r>
         <w:rPr>
           <w:color w:val="000000" w:themeColor="text1"/>
           <w:lang w:val="es-MX"/>
         </w:rPr>
-        <w:t>PLoS</w:t>
-      </w:r>
-      <w:proofErr w:type="spellEnd"/>
-      <w:r>
-        <w:rPr>
-          <w:color w:val="000000" w:themeColor="text1"/>
-          <w:lang w:val="es-MX"/>
-        </w:rPr>
-        <w:t xml:space="preserve"> </w:t>
-      </w:r>
-      <w:proofErr w:type="spellStart"/>
-      <w:r>
-        <w:rPr>
-          <w:color w:val="000000" w:themeColor="text1"/>
-          <w:lang w:val="es-MX"/>
-        </w:rPr>
-        <w:t>Biology</w:t>
-      </w:r>
-      <w:proofErr w:type="spellEnd"/>
-      <w:r>
-        <w:rPr>
-          <w:color w:val="000000" w:themeColor="text1"/>
-          <w:lang w:val="es-MX"/>
-        </w:rPr>
-        <w:t xml:space="preserve">, 20(3), e3001567. </w:t>
-      </w:r>
-      <w:hyperlink r:id="rId15" w:tgtFrame="_blank" w:history="1">
+        <w:t xml:space="preserve">PLoS Biology, 20(3), e3001567. </w:t>
+      </w:r>
+      <w:hyperlink r:id="rId13" w:tgtFrame="_blank" w:history="1">
         <w:r>
           <w:rPr>
             <w:rStyle w:val="Hyperlink"/>
@@ -3561,45 +3446,20 @@
           <w:color w:val="000000" w:themeColor="text1"/>
         </w:rPr>
       </w:pPr>
-      <w:proofErr w:type="spellStart"/>
       <w:r>
         <w:rPr>
           <w:color w:val="000000" w:themeColor="text1"/>
           <w:lang w:val="es-MX"/>
         </w:rPr>
-        <w:t>Honma</w:t>
-      </w:r>
-      <w:proofErr w:type="spellEnd"/>
+        <w:t xml:space="preserve">Honma, S., &amp; Honma, K.I. (2019). </w:t>
+      </w:r>
       <w:r>
         <w:rPr>
           <w:color w:val="000000" w:themeColor="text1"/>
-          <w:lang w:val="es-MX"/>
-        </w:rPr>
-        <w:t xml:space="preserve">, S., &amp; </w:t>
-      </w:r>
-      <w:proofErr w:type="spellStart"/>
-      <w:r>
-        <w:rPr>
-          <w:color w:val="000000" w:themeColor="text1"/>
-          <w:lang w:val="es-MX"/>
-        </w:rPr>
-        <w:t>Honma</w:t>
-      </w:r>
-      <w:proofErr w:type="spellEnd"/>
-      <w:r>
-        <w:rPr>
-          <w:color w:val="000000" w:themeColor="text1"/>
-          <w:lang w:val="es-MX"/>
-        </w:rPr>
-        <w:t xml:space="preserve">, K.I. (2019). </w:t>
-      </w:r>
-      <w:r>
-        <w:rPr>
-          <w:color w:val="000000" w:themeColor="text1"/>
         </w:rPr>
         <w:t xml:space="preserve">The mammalian circadian timing system and the suprachiasmatic nucleus as its pacemaker. Biology, 8(1), 13. </w:t>
       </w:r>
-      <w:hyperlink r:id="rId16" w:tgtFrame="_blank" w:history="1">
+      <w:hyperlink r:id="rId14" w:tgtFrame="_blank" w:history="1">
         <w:r>
           <w:rPr>
             <w:rStyle w:val="Hyperlink"/>
@@ -3622,21 +3482,13 @@
           <w:color w:val="000000" w:themeColor="text1"/>
         </w:rPr>
       </w:pPr>
-      <w:proofErr w:type="spellStart"/>
       <w:r>
         <w:rPr>
           <w:color w:val="000000" w:themeColor="text1"/>
         </w:rPr>
-        <w:t>Paschos</w:t>
-      </w:r>
-      <w:proofErr w:type="spellEnd"/>
-      <w:r>
-        <w:rPr>
-          <w:color w:val="000000" w:themeColor="text1"/>
-        </w:rPr>
-        <w:t xml:space="preserve">, G.K., &amp; FitzGerald, G.A. (2010). Circadian clocks and vascular function. Circulation Research, 106(5), 833-841. </w:t>
-      </w:r>
-      <w:hyperlink r:id="rId17" w:tgtFrame="_blank" w:history="1">
+        <w:t xml:space="preserve">Paschos, G.K., &amp; FitzGerald, G.A. (2010). Circadian clocks and vascular function. Circulation Research, 106(5), 833-841. </w:t>
+      </w:r>
+      <w:hyperlink r:id="rId15" w:tgtFrame="_blank" w:history="1">
         <w:r>
           <w:rPr>
             <w:rStyle w:val="Hyperlink"/>
@@ -3665,7 +3517,7 @@
         </w:rPr>
         <w:t xml:space="preserve">Hastings, M. H., et al. (2003). A clockwork web: circadian timing in brain and periphery. Nature Reviews Neuroscience, 4(8), 649–661. </w:t>
       </w:r>
-      <w:hyperlink r:id="rId18" w:tgtFrame="_blank" w:history="1">
+      <w:hyperlink r:id="rId16" w:tgtFrame="_blank" w:history="1">
         <w:r>
           <w:rPr>
             <w:rStyle w:val="Hyperlink"/>
@@ -3688,63 +3540,13 @@
           <w:color w:val="000000" w:themeColor="text1"/>
         </w:rPr>
       </w:pPr>
-      <w:proofErr w:type="spellStart"/>
       <w:r>
         <w:rPr>
           <w:color w:val="000000" w:themeColor="text1"/>
         </w:rPr>
-        <w:t>Nangle</w:t>
-      </w:r>
-      <w:proofErr w:type="spellEnd"/>
-      <w:r>
-        <w:rPr>
-          <w:color w:val="000000" w:themeColor="text1"/>
-        </w:rPr>
-        <w:t xml:space="preserve">, S. N., </w:t>
-      </w:r>
-      <w:proofErr w:type="spellStart"/>
-      <w:r>
-        <w:rPr>
-          <w:color w:val="000000" w:themeColor="text1"/>
-        </w:rPr>
-        <w:t>Rosensweig</w:t>
-      </w:r>
-      <w:proofErr w:type="spellEnd"/>
-      <w:r>
-        <w:rPr>
-          <w:color w:val="000000" w:themeColor="text1"/>
-        </w:rPr>
-        <w:t xml:space="preserve">, C., Koike, N., </w:t>
-      </w:r>
-      <w:proofErr w:type="spellStart"/>
-      <w:r>
-        <w:rPr>
-          <w:color w:val="000000" w:themeColor="text1"/>
-        </w:rPr>
-        <w:t>Tei</w:t>
-      </w:r>
-      <w:proofErr w:type="spellEnd"/>
-      <w:r>
-        <w:rPr>
-          <w:color w:val="000000" w:themeColor="text1"/>
-        </w:rPr>
-        <w:t xml:space="preserve">, H., Takahashi, J. S., Green, C. B., &amp; Zheng, N. (2014). Molecular assembly of the period-cryptochrome circadian transcriptional repressor complex. </w:t>
-      </w:r>
-      <w:proofErr w:type="spellStart"/>
-      <w:r>
-        <w:rPr>
-          <w:color w:val="000000" w:themeColor="text1"/>
-        </w:rPr>
-        <w:t>eLife</w:t>
-      </w:r>
-      <w:proofErr w:type="spellEnd"/>
-      <w:r>
-        <w:rPr>
-          <w:color w:val="000000" w:themeColor="text1"/>
-        </w:rPr>
-        <w:t xml:space="preserve">, 3, e03674. </w:t>
-      </w:r>
-      <w:hyperlink r:id="rId19" w:tgtFrame="_blank" w:history="1">
+        <w:t xml:space="preserve">Nangle, S. N., Rosensweig, C., Koike, N., Tei, H., Takahashi, J. S., Green, C. B., &amp; Zheng, N. (2014). Molecular assembly of the period-cryptochrome circadian transcriptional repressor complex. eLife, 3, e03674. </w:t>
+      </w:r>
+      <w:hyperlink r:id="rId17" w:tgtFrame="_blank" w:history="1">
         <w:r>
           <w:rPr>
             <w:rStyle w:val="Hyperlink"/>
@@ -3767,21 +3569,13 @@
           <w:color w:val="000000" w:themeColor="text1"/>
         </w:rPr>
       </w:pPr>
-      <w:proofErr w:type="spellStart"/>
       <w:r>
         <w:rPr>
           <w:color w:val="000000" w:themeColor="text1"/>
         </w:rPr>
-        <w:t>Heyde</w:t>
-      </w:r>
-      <w:proofErr w:type="spellEnd"/>
-      <w:r>
-        <w:rPr>
-          <w:color w:val="000000" w:themeColor="text1"/>
-        </w:rPr>
-        <w:t xml:space="preserve">, I., &amp; Oster, H. (2019). Differentiating external zeitgeber impact on peripheral circadian clock resetting. Scientific Reports, 9, 20114. </w:t>
-      </w:r>
-      <w:hyperlink r:id="rId20" w:tgtFrame="_blank" w:history="1">
+        <w:t xml:space="preserve">Heyde, I., &amp; Oster, H. (2019). Differentiating external zeitgeber impact on peripheral circadian clock resetting. Scientific Reports, 9, 20114. </w:t>
+      </w:r>
+      <w:hyperlink r:id="rId18" w:tgtFrame="_blank" w:history="1">
         <w:r>
           <w:rPr>
             <w:rStyle w:val="Hyperlink"/>
@@ -3810,7 +3604,7 @@
         </w:rPr>
         <w:t xml:space="preserve">Wu, J., &amp; Zhao, Z. (2024). Acupuncture in circadian rhythm sleep–wake disorders and its potential neurochemical mechanisms. Frontiers in Neuroscience, 18, 1346635. </w:t>
       </w:r>
-      <w:hyperlink r:id="rId21" w:tgtFrame="_blank" w:history="1">
+      <w:hyperlink r:id="rId19" w:tgtFrame="_blank" w:history="1">
         <w:r>
           <w:rPr>
             <w:rStyle w:val="Hyperlink"/>
@@ -5310,6 +5104,7 @@
     <w:lsdException w:name="HTML Sample" w:semiHidden="1" w:unhideWhenUsed="1"/>
     <w:lsdException w:name="HTML Typewriter" w:semiHidden="1" w:unhideWhenUsed="1"/>
     <w:lsdException w:name="HTML Variable" w:semiHidden="1" w:unhideWhenUsed="1"/>
+    <w:lsdException w:name="Normal Table" w:semiHidden="1" w:unhideWhenUsed="1"/>
     <w:lsdException w:name="annotation subject" w:semiHidden="1" w:unhideWhenUsed="1"/>
     <w:lsdException w:name="No List" w:semiHidden="1" w:unhideWhenUsed="1"/>
     <w:lsdException w:name="Outline List 1" w:semiHidden="1" w:unhideWhenUsed="1"/>
@@ -5356,8 +5151,10 @@
     <w:lsdException w:name="Table Subtle 2" w:semiHidden="1" w:unhideWhenUsed="1"/>
     <w:lsdException w:name="Table Web 1" w:semiHidden="1" w:unhideWhenUsed="1"/>
     <w:lsdException w:name="Table Web 2" w:semiHidden="1" w:unhideWhenUsed="1"/>
+    <w:lsdException w:name="Table Web 3" w:semiHidden="1" w:unhideWhenUsed="1"/>
     <w:lsdException w:name="Balloon Text" w:semiHidden="1" w:unhideWhenUsed="1"/>
     <w:lsdException w:name="Table Grid" w:uiPriority="39"/>
+    <w:lsdException w:name="Table Theme" w:semiHidden="1" w:unhideWhenUsed="1"/>
     <w:lsdException w:name="Placeholder Text" w:semiHidden="1"/>
     <w:lsdException w:name="No Spacing" w:uiPriority="1" w:qFormat="1"/>
     <w:lsdException w:name="Light Shading" w:uiPriority="60"/>

</xml_diff>

<commit_message>
Add AT call-for-research PDF and update source document.
Co-authored-by: Cursor <cursoragent@cursor.com>
</commit_message>
<xml_diff>
--- a/AT_CallForResearch.docx
+++ b/AT_CallForResearch.docx
@@ -1,6 +1,6 @@
 
 <file path=word/document.xml><?xml version="1.0" encoding="utf-8"?>
-<w:document xmlns:wpc="http://schemas.microsoft.com/office/word/2010/wordprocessingCanvas" xmlns:cx="http://schemas.microsoft.com/office/drawing/2014/chartex" xmlns:cx1="http://schemas.microsoft.com/office/drawing/2015/9/8/chartex" xmlns:cx2="http://schemas.microsoft.com/office/drawing/2015/10/21/chartex" xmlns:cx3="http://schemas.microsoft.com/office/drawing/2016/5/9/chartex" xmlns:cx4="http://schemas.microsoft.com/office/drawing/2016/5/10/chartex" xmlns:cx5="http://schemas.microsoft.com/office/drawing/2016/5/11/chartex" xmlns:cx6="http://schemas.microsoft.com/office/drawing/2016/5/12/chartex" xmlns:cx7="http://schemas.microsoft.com/office/drawing/2016/5/13/chartex" xmlns:cx8="http://schemas.microsoft.com/office/drawing/2016/5/14/chartex" xmlns:mc="http://schemas.openxmlformats.org/markup-compatibility/2006" xmlns:aink="http://schemas.microsoft.com/office/drawing/2016/ink" xmlns:am3d="http://schemas.microsoft.com/office/drawing/2017/model3d" xmlns:o="urn:schemas-microsoft-com:office:office" xmlns:r="http://schemas.openxmlformats.org/officeDocument/2006/relationships" xmlns:m="http://schemas.openxmlformats.org/officeDocument/2006/math" xmlns:v="urn:schemas-microsoft-com:vml" xmlns:wp14="http://schemas.microsoft.com/office/word/2010/wordprocessingDrawing" xmlns:wp="http://schemas.openxmlformats.org/drawingml/2006/wordprocessingDrawing" xmlns:w10="urn:schemas-microsoft-com:office:word" xmlns:w="http://schemas.openxmlformats.org/wordprocessingml/2006/main" xmlns:w14="http://schemas.microsoft.com/office/word/2010/wordml" xmlns:w15="http://schemas.microsoft.com/office/word/2012/wordml" xmlns:w16cex="http://schemas.microsoft.com/office/word/2018/wordml/cex" xmlns:w16cid="http://schemas.microsoft.com/office/word/2016/wordml/cid" xmlns:w16="http://schemas.microsoft.com/office/word/2018/wordml" xmlns:w16se="http://schemas.microsoft.com/office/word/2015/wordml/symex" xmlns:wpg="http://schemas.microsoft.com/office/word/2010/wordprocessingGroup" xmlns:wpi="http://schemas.microsoft.com/office/word/2010/wordprocessingInk" xmlns:wne="http://schemas.microsoft.com/office/word/2006/wordml" xmlns:wps="http://schemas.microsoft.com/office/word/2010/wordprocessingShape" mc:Ignorable="w14 w15 w16se w16cid w16 w16cex wp14">
+<w:document xmlns:wpc="http://schemas.microsoft.com/office/word/2010/wordprocessingCanvas" xmlns:cx="http://schemas.microsoft.com/office/drawing/2014/chartex" xmlns:cx1="http://schemas.microsoft.com/office/drawing/2015/9/8/chartex" xmlns:cx2="http://schemas.microsoft.com/office/drawing/2015/10/21/chartex" xmlns:cx3="http://schemas.microsoft.com/office/drawing/2016/5/9/chartex" xmlns:cx4="http://schemas.microsoft.com/office/drawing/2016/5/10/chartex" xmlns:cx5="http://schemas.microsoft.com/office/drawing/2016/5/11/chartex" xmlns:cx6="http://schemas.microsoft.com/office/drawing/2016/5/12/chartex" xmlns:cx7="http://schemas.microsoft.com/office/drawing/2016/5/13/chartex" xmlns:cx8="http://schemas.microsoft.com/office/drawing/2016/5/14/chartex" xmlns:mc="http://schemas.openxmlformats.org/markup-compatibility/2006" xmlns:aink="http://schemas.microsoft.com/office/drawing/2016/ink" xmlns:am3d="http://schemas.microsoft.com/office/drawing/2017/model3d" xmlns:o="urn:schemas-microsoft-com:office:office" xmlns:oel="http://schemas.microsoft.com/office/2019/extlst" xmlns:r="http://schemas.openxmlformats.org/officeDocument/2006/relationships" xmlns:m="http://schemas.openxmlformats.org/officeDocument/2006/math" xmlns:v="urn:schemas-microsoft-com:vml" xmlns:wp14="http://schemas.microsoft.com/office/word/2010/wordprocessingDrawing" xmlns:wp="http://schemas.openxmlformats.org/drawingml/2006/wordprocessingDrawing" xmlns:w10="urn:schemas-microsoft-com:office:word" xmlns:w="http://schemas.openxmlformats.org/wordprocessingml/2006/main" xmlns:w14="http://schemas.microsoft.com/office/word/2010/wordml" xmlns:w15="http://schemas.microsoft.com/office/word/2012/wordml" xmlns:w16cex="http://schemas.microsoft.com/office/word/2018/wordml/cex" xmlns:w16cid="http://schemas.microsoft.com/office/word/2016/wordml/cid" xmlns:w16="http://schemas.microsoft.com/office/word/2018/wordml" xmlns:w16sdtdh="http://schemas.microsoft.com/office/word/2020/wordml/sdtdatahash" xmlns:w16se="http://schemas.microsoft.com/office/word/2015/wordml/symex" xmlns:wpg="http://schemas.microsoft.com/office/word/2010/wordprocessingGroup" xmlns:wpi="http://schemas.microsoft.com/office/word/2010/wordprocessingInk" xmlns:wne="http://schemas.microsoft.com/office/word/2006/wordml" xmlns:wps="http://schemas.microsoft.com/office/word/2010/wordprocessingShape" mc:Ignorable="w14 w15 w16se w16cid w16 w16cex w16sdtdh wp14">
   <w:body>
     <w:p>
       <w:pPr>
@@ -34,8 +34,18 @@
           <w:b w:val="0"/>
           <w:bCs w:val="0"/>
         </w:rPr>
-        <w:t>Steven Schram PhD, DC, LAc</w:t>
-      </w:r>
+        <w:t xml:space="preserve">Steven Schram PhD, DC, </w:t>
+      </w:r>
+      <w:proofErr w:type="spellStart"/>
+      <w:r>
+        <w:rPr>
+          <w:rStyle w:val="Strong"/>
+          <w:b w:val="0"/>
+          <w:bCs w:val="0"/>
+        </w:rPr>
+        <w:t>LAc</w:t>
+      </w:r>
+      <w:proofErr w:type="spellEnd"/>
     </w:p>
     <w:p>
       <w:pPr>
@@ -2772,7 +2782,15 @@
         <w:t xml:space="preserve">app is entirely free with no </w:t>
       </w:r>
       <w:r>
-        <w:t xml:space="preserve">add-ons, upgrades or </w:t>
+        <w:t xml:space="preserve">add-ons, </w:t>
+      </w:r>
+      <w:proofErr w:type="gramStart"/>
+      <w:r>
+        <w:t>upgrades</w:t>
+      </w:r>
+      <w:proofErr w:type="gramEnd"/>
+      <w:r>
+        <w:t xml:space="preserve"> or </w:t>
       </w:r>
       <w:r>
         <w:t>advertisements. As an incentive, participants who use the app for a valid journey and complete the survey will enjoy free lifetime access</w:t>
@@ -3106,6 +3124,8 @@
           <w:color w:val="000000" w:themeColor="text1"/>
         </w:rPr>
       </w:pPr>
+      <w:bookmarkStart w:id="0" w:name="OLE_LINK1"/>
+      <w:bookmarkStart w:id="1" w:name="OLE_LINK2"/>
       <w:r>
         <w:rPr>
           <w:rFonts w:eastAsia="Times New Roman"/>
@@ -3191,15 +3211,20 @@
         <w:t xml:space="preserve">the number of </w:t>
       </w:r>
       <w:r>
-        <w:t>time zones crossed</w:t>
+        <w:t>time zo</w:t>
+      </w:r>
+      <w:r>
+        <w:t>nes crossed</w:t>
       </w:r>
       <w:r>
         <w:t>.</w:t>
       </w:r>
       <w:r>
-        <w:t xml:space="preserve"> </w:t>
+        <w:t xml:space="preserve"> This study is pre-registered at Open Science Framework: osf.io/jm4w7.</w:t>
       </w:r>
     </w:p>
+    <w:bookmarkEnd w:id="0"/>
+    <w:bookmarkEnd w:id="1"/>
     <w:p>
       <w:pPr>
         <w:pStyle w:val="Heading2"/>
@@ -3357,11 +3382,19 @@
           <w:color w:val="000000" w:themeColor="text1"/>
         </w:rPr>
       </w:pPr>
+      <w:proofErr w:type="spellStart"/>
       <w:r>
         <w:rPr>
           <w:color w:val="000000" w:themeColor="text1"/>
         </w:rPr>
-        <w:t>Khoe, W.H. (1978). Treatment of jet lag syndrome by acupuncture. American Journal of Acupuncture, 6(2), 135–139.</w:t>
+        <w:t>Khoe</w:t>
+      </w:r>
+      <w:proofErr w:type="spellEnd"/>
+      <w:r>
+        <w:rPr>
+          <w:color w:val="000000" w:themeColor="text1"/>
+        </w:rPr>
+        <w:t>, W.H. (1978). Treatment of jet lag syndrome by acupuncture. American Journal of Acupuncture, 6(2), 135–139.</w:t>
       </w:r>
     </w:p>
     <w:p>
@@ -3422,16 +3455,31 @@
         </w:rPr>
         <w:t xml:space="preserve">PLoS Biology, 20(3), e3001567. </w:t>
       </w:r>
-      <w:hyperlink r:id="rId13" w:tgtFrame="_blank" w:history="1">
-        <w:r>
-          <w:rPr>
-            <w:rStyle w:val="Hyperlink"/>
-            <w:color w:val="000000" w:themeColor="text1"/>
-            <w:lang w:val="es-MX"/>
-          </w:rPr>
-          <w:t>https://doi.org/10.1371/journal.pbio.3001567</w:t>
-        </w:r>
-      </w:hyperlink>
+      <w:r>
+        <w:fldChar w:fldCharType="begin"/>
+      </w:r>
+      <w:r>
+        <w:instrText>HYPERLINK "https://doi.org/10.1371/journal.pbio.3001567" \t "_blank"</w:instrText>
+      </w:r>
+      <w:r>
+        <w:fldChar w:fldCharType="separate"/>
+      </w:r>
+      <w:r>
+        <w:rPr>
+          <w:rStyle w:val="Hyperlink"/>
+          <w:color w:val="000000" w:themeColor="text1"/>
+          <w:lang w:val="es-MX"/>
+        </w:rPr>
+        <w:t>https://doi.org/10.1371/journal.pbio.3001567</w:t>
+      </w:r>
+      <w:r>
+        <w:rPr>
+          <w:rStyle w:val="Hyperlink"/>
+          <w:color w:val="000000" w:themeColor="text1"/>
+          <w:lang w:val="es-MX"/>
+        </w:rPr>
+        <w:fldChar w:fldCharType="end"/>
+      </w:r>
     </w:p>
     <w:p>
       <w:pPr>
@@ -3459,7 +3507,7 @@
         </w:rPr>
         <w:t xml:space="preserve">The mammalian circadian timing system and the suprachiasmatic nucleus as its pacemaker. Biology, 8(1), 13. </w:t>
       </w:r>
-      <w:hyperlink r:id="rId14" w:tgtFrame="_blank" w:history="1">
+      <w:hyperlink r:id="rId13" w:tgtFrame="_blank" w:history="1">
         <w:r>
           <w:rPr>
             <w:rStyle w:val="Hyperlink"/>
@@ -3482,13 +3530,21 @@
           <w:color w:val="000000" w:themeColor="text1"/>
         </w:rPr>
       </w:pPr>
+      <w:proofErr w:type="spellStart"/>
       <w:r>
         <w:rPr>
           <w:color w:val="000000" w:themeColor="text1"/>
         </w:rPr>
-        <w:t xml:space="preserve">Paschos, G.K., &amp; FitzGerald, G.A. (2010). Circadian clocks and vascular function. Circulation Research, 106(5), 833-841. </w:t>
-      </w:r>
-      <w:hyperlink r:id="rId15" w:tgtFrame="_blank" w:history="1">
+        <w:t>Paschos</w:t>
+      </w:r>
+      <w:proofErr w:type="spellEnd"/>
+      <w:r>
+        <w:rPr>
+          <w:color w:val="000000" w:themeColor="text1"/>
+        </w:rPr>
+        <w:t xml:space="preserve">, G.K., &amp; FitzGerald, G.A. (2010). Circadian clocks and vascular function. Circulation Research, 106(5), 833-841. </w:t>
+      </w:r>
+      <w:hyperlink r:id="rId14" w:tgtFrame="_blank" w:history="1">
         <w:r>
           <w:rPr>
             <w:rStyle w:val="Hyperlink"/>
@@ -3517,7 +3573,7 @@
         </w:rPr>
         <w:t xml:space="preserve">Hastings, M. H., et al. (2003). A clockwork web: circadian timing in brain and periphery. Nature Reviews Neuroscience, 4(8), 649–661. </w:t>
       </w:r>
-      <w:hyperlink r:id="rId16" w:tgtFrame="_blank" w:history="1">
+      <w:hyperlink r:id="rId15" w:tgtFrame="_blank" w:history="1">
         <w:r>
           <w:rPr>
             <w:rStyle w:val="Hyperlink"/>
@@ -3540,13 +3596,63 @@
           <w:color w:val="000000" w:themeColor="text1"/>
         </w:rPr>
       </w:pPr>
+      <w:proofErr w:type="spellStart"/>
       <w:r>
         <w:rPr>
           <w:color w:val="000000" w:themeColor="text1"/>
         </w:rPr>
-        <w:t xml:space="preserve">Nangle, S. N., Rosensweig, C., Koike, N., Tei, H., Takahashi, J. S., Green, C. B., &amp; Zheng, N. (2014). Molecular assembly of the period-cryptochrome circadian transcriptional repressor complex. eLife, 3, e03674. </w:t>
-      </w:r>
-      <w:hyperlink r:id="rId17" w:tgtFrame="_blank" w:history="1">
+        <w:t>Nangle</w:t>
+      </w:r>
+      <w:proofErr w:type="spellEnd"/>
+      <w:r>
+        <w:rPr>
+          <w:color w:val="000000" w:themeColor="text1"/>
+        </w:rPr>
+        <w:t xml:space="preserve">, S. N., </w:t>
+      </w:r>
+      <w:proofErr w:type="spellStart"/>
+      <w:r>
+        <w:rPr>
+          <w:color w:val="000000" w:themeColor="text1"/>
+        </w:rPr>
+        <w:t>Rosensweig</w:t>
+      </w:r>
+      <w:proofErr w:type="spellEnd"/>
+      <w:r>
+        <w:rPr>
+          <w:color w:val="000000" w:themeColor="text1"/>
+        </w:rPr>
+        <w:t xml:space="preserve">, C., Koike, N., </w:t>
+      </w:r>
+      <w:proofErr w:type="spellStart"/>
+      <w:r>
+        <w:rPr>
+          <w:color w:val="000000" w:themeColor="text1"/>
+        </w:rPr>
+        <w:t>Tei</w:t>
+      </w:r>
+      <w:proofErr w:type="spellEnd"/>
+      <w:r>
+        <w:rPr>
+          <w:color w:val="000000" w:themeColor="text1"/>
+        </w:rPr>
+        <w:t xml:space="preserve">, H., Takahashi, J. S., Green, C. B., &amp; Zheng, N. (2014). Molecular assembly of the period-cryptochrome circadian transcriptional repressor complex. </w:t>
+      </w:r>
+      <w:proofErr w:type="spellStart"/>
+      <w:r>
+        <w:rPr>
+          <w:color w:val="000000" w:themeColor="text1"/>
+        </w:rPr>
+        <w:t>eLife</w:t>
+      </w:r>
+      <w:proofErr w:type="spellEnd"/>
+      <w:r>
+        <w:rPr>
+          <w:color w:val="000000" w:themeColor="text1"/>
+        </w:rPr>
+        <w:t xml:space="preserve">, 3, e03674. </w:t>
+      </w:r>
+      <w:hyperlink r:id="rId16" w:tgtFrame="_blank" w:history="1">
         <w:r>
           <w:rPr>
             <w:rStyle w:val="Hyperlink"/>
@@ -3569,13 +3675,21 @@
           <w:color w:val="000000" w:themeColor="text1"/>
         </w:rPr>
       </w:pPr>
+      <w:proofErr w:type="spellStart"/>
       <w:r>
         <w:rPr>
           <w:color w:val="000000" w:themeColor="text1"/>
         </w:rPr>
-        <w:t xml:space="preserve">Heyde, I., &amp; Oster, H. (2019). Differentiating external zeitgeber impact on peripheral circadian clock resetting. Scientific Reports, 9, 20114. </w:t>
-      </w:r>
-      <w:hyperlink r:id="rId18" w:tgtFrame="_blank" w:history="1">
+        <w:t>Heyde</w:t>
+      </w:r>
+      <w:proofErr w:type="spellEnd"/>
+      <w:r>
+        <w:rPr>
+          <w:color w:val="000000" w:themeColor="text1"/>
+        </w:rPr>
+        <w:t xml:space="preserve">, I., &amp; Oster, H. (2019). Differentiating external zeitgeber impact on peripheral circadian clock resetting. Scientific Reports, 9, 20114. </w:t>
+      </w:r>
+      <w:hyperlink r:id="rId17" w:tgtFrame="_blank" w:history="1">
         <w:r>
           <w:rPr>
             <w:rStyle w:val="Hyperlink"/>
@@ -3604,7 +3718,7 @@
         </w:rPr>
         <w:t xml:space="preserve">Wu, J., &amp; Zhao, Z. (2024). Acupuncture in circadian rhythm sleep–wake disorders and its potential neurochemical mechanisms. Frontiers in Neuroscience, 18, 1346635. </w:t>
       </w:r>
-      <w:hyperlink r:id="rId19" w:tgtFrame="_blank" w:history="1">
+      <w:hyperlink r:id="rId18" w:tgtFrame="_blank" w:history="1">
         <w:r>
           <w:rPr>
             <w:rStyle w:val="Hyperlink"/>
@@ -3641,7 +3755,7 @@
 </file>
 
 <file path=word/numbering.xml><?xml version="1.0" encoding="utf-8"?>
-<w:numbering xmlns:wpc="http://schemas.microsoft.com/office/word/2010/wordprocessingCanvas" xmlns:cx="http://schemas.microsoft.com/office/drawing/2014/chartex" xmlns:cx1="http://schemas.microsoft.com/office/drawing/2015/9/8/chartex" xmlns:cx2="http://schemas.microsoft.com/office/drawing/2015/10/21/chartex" xmlns:cx3="http://schemas.microsoft.com/office/drawing/2016/5/9/chartex" xmlns:cx4="http://schemas.microsoft.com/office/drawing/2016/5/10/chartex" xmlns:cx5="http://schemas.microsoft.com/office/drawing/2016/5/11/chartex" xmlns:cx6="http://schemas.microsoft.com/office/drawing/2016/5/12/chartex" xmlns:cx7="http://schemas.microsoft.com/office/drawing/2016/5/13/chartex" xmlns:cx8="http://schemas.microsoft.com/office/drawing/2016/5/14/chartex" xmlns:mc="http://schemas.openxmlformats.org/markup-compatibility/2006" xmlns:aink="http://schemas.microsoft.com/office/drawing/2016/ink" xmlns:am3d="http://schemas.microsoft.com/office/drawing/2017/model3d" xmlns:o="urn:schemas-microsoft-com:office:office" xmlns:r="http://schemas.openxmlformats.org/officeDocument/2006/relationships" xmlns:m="http://schemas.openxmlformats.org/officeDocument/2006/math" xmlns:v="urn:schemas-microsoft-com:vml" xmlns:wp14="http://schemas.microsoft.com/office/word/2010/wordprocessingDrawing" xmlns:wp="http://schemas.openxmlformats.org/drawingml/2006/wordprocessingDrawing" xmlns:w10="urn:schemas-microsoft-com:office:word" xmlns:w="http://schemas.openxmlformats.org/wordprocessingml/2006/main" xmlns:w14="http://schemas.microsoft.com/office/word/2010/wordml" xmlns:w15="http://schemas.microsoft.com/office/word/2012/wordml" xmlns:w16cex="http://schemas.microsoft.com/office/word/2018/wordml/cex" xmlns:w16cid="http://schemas.microsoft.com/office/word/2016/wordml/cid" xmlns:w16="http://schemas.microsoft.com/office/word/2018/wordml" xmlns:w16se="http://schemas.microsoft.com/office/word/2015/wordml/symex" xmlns:wpg="http://schemas.microsoft.com/office/word/2010/wordprocessingGroup" xmlns:wpi="http://schemas.microsoft.com/office/word/2010/wordprocessingInk" xmlns:wne="http://schemas.microsoft.com/office/word/2006/wordml" xmlns:wps="http://schemas.microsoft.com/office/word/2010/wordprocessingShape" mc:Ignorable="w14 w15 w16se w16cid w16 w16cex wp14">
+<w:numbering xmlns:wpc="http://schemas.microsoft.com/office/word/2010/wordprocessingCanvas" xmlns:cx="http://schemas.microsoft.com/office/drawing/2014/chartex" xmlns:cx1="http://schemas.microsoft.com/office/drawing/2015/9/8/chartex" xmlns:cx2="http://schemas.microsoft.com/office/drawing/2015/10/21/chartex" xmlns:cx3="http://schemas.microsoft.com/office/drawing/2016/5/9/chartex" xmlns:cx4="http://schemas.microsoft.com/office/drawing/2016/5/10/chartex" xmlns:cx5="http://schemas.microsoft.com/office/drawing/2016/5/11/chartex" xmlns:cx6="http://schemas.microsoft.com/office/drawing/2016/5/12/chartex" xmlns:cx7="http://schemas.microsoft.com/office/drawing/2016/5/13/chartex" xmlns:cx8="http://schemas.microsoft.com/office/drawing/2016/5/14/chartex" xmlns:mc="http://schemas.openxmlformats.org/markup-compatibility/2006" xmlns:aink="http://schemas.microsoft.com/office/drawing/2016/ink" xmlns:am3d="http://schemas.microsoft.com/office/drawing/2017/model3d" xmlns:o="urn:schemas-microsoft-com:office:office" xmlns:oel="http://schemas.microsoft.com/office/2019/extlst" xmlns:r="http://schemas.openxmlformats.org/officeDocument/2006/relationships" xmlns:m="http://schemas.openxmlformats.org/officeDocument/2006/math" xmlns:v="urn:schemas-microsoft-com:vml" xmlns:wp14="http://schemas.microsoft.com/office/word/2010/wordprocessingDrawing" xmlns:wp="http://schemas.openxmlformats.org/drawingml/2006/wordprocessingDrawing" xmlns:w10="urn:schemas-microsoft-com:office:word" xmlns:w="http://schemas.openxmlformats.org/wordprocessingml/2006/main" xmlns:w14="http://schemas.microsoft.com/office/word/2010/wordml" xmlns:w15="http://schemas.microsoft.com/office/word/2012/wordml" xmlns:w16cex="http://schemas.microsoft.com/office/word/2018/wordml/cex" xmlns:w16cid="http://schemas.microsoft.com/office/word/2016/wordml/cid" xmlns:w16="http://schemas.microsoft.com/office/word/2018/wordml" xmlns:w16sdtdh="http://schemas.microsoft.com/office/word/2020/wordml/sdtdatahash" xmlns:w16se="http://schemas.microsoft.com/office/word/2015/wordml/symex" xmlns:wpg="http://schemas.microsoft.com/office/word/2010/wordprocessingGroup" xmlns:wpi="http://schemas.microsoft.com/office/word/2010/wordprocessingInk" xmlns:wne="http://schemas.microsoft.com/office/word/2006/wordml" xmlns:wps="http://schemas.microsoft.com/office/word/2010/wordprocessingShape" mc:Ignorable="w14 w15 w16se w16cid w16 w16cex w16sdtdh wp14">
   <w:abstractNum w:abstractNumId="0" w15:restartNumberingAfterBreak="0">
     <w:nsid w:val="01291F70"/>
     <w:multiLevelType w:val="hybridMultilevel"/>
@@ -4954,41 +5068,41 @@
       </w:rPr>
     </w:lvl>
   </w:abstractNum>
-  <w:num w:numId="1">
+  <w:num w:numId="1" w16cid:durableId="10768411">
     <w:abstractNumId w:val="5"/>
   </w:num>
-  <w:num w:numId="2">
+  <w:num w:numId="2" w16cid:durableId="1498112529">
     <w:abstractNumId w:val="8"/>
   </w:num>
-  <w:num w:numId="3">
+  <w:num w:numId="3" w16cid:durableId="594828661">
     <w:abstractNumId w:val="6"/>
   </w:num>
-  <w:num w:numId="4">
+  <w:num w:numId="4" w16cid:durableId="1829705971">
     <w:abstractNumId w:val="1"/>
   </w:num>
-  <w:num w:numId="5">
+  <w:num w:numId="5" w16cid:durableId="1931113277">
     <w:abstractNumId w:val="3"/>
   </w:num>
-  <w:num w:numId="6">
+  <w:num w:numId="6" w16cid:durableId="1305159463">
     <w:abstractNumId w:val="2"/>
   </w:num>
-  <w:num w:numId="7">
+  <w:num w:numId="7" w16cid:durableId="690179744">
     <w:abstractNumId w:val="7"/>
   </w:num>
-  <w:num w:numId="8">
+  <w:num w:numId="8" w16cid:durableId="133184558">
     <w:abstractNumId w:val="0"/>
   </w:num>
-  <w:num w:numId="9">
+  <w:num w:numId="9" w16cid:durableId="479150323">
     <w:abstractNumId w:val="4"/>
   </w:num>
-  <w:num w:numId="10">
+  <w:num w:numId="10" w16cid:durableId="181282531">
     <w:abstractNumId w:val="9"/>
   </w:num>
 </w:numbering>
 </file>
 
 <file path=word/styles.xml><?xml version="1.0" encoding="utf-8"?>
-<w:styles xmlns:mc="http://schemas.openxmlformats.org/markup-compatibility/2006" xmlns:r="http://schemas.openxmlformats.org/officeDocument/2006/relationships" xmlns:w="http://schemas.openxmlformats.org/wordprocessingml/2006/main" xmlns:w14="http://schemas.microsoft.com/office/word/2010/wordml" xmlns:w15="http://schemas.microsoft.com/office/word/2012/wordml" xmlns:w16cex="http://schemas.microsoft.com/office/word/2018/wordml/cex" xmlns:w16cid="http://schemas.microsoft.com/office/word/2016/wordml/cid" xmlns:w16="http://schemas.microsoft.com/office/word/2018/wordml" xmlns:w16se="http://schemas.microsoft.com/office/word/2015/wordml/symex" mc:Ignorable="w14 w15 w16se w16cid w16 w16cex">
+<w:styles xmlns:mc="http://schemas.openxmlformats.org/markup-compatibility/2006" xmlns:r="http://schemas.openxmlformats.org/officeDocument/2006/relationships" xmlns:w="http://schemas.openxmlformats.org/wordprocessingml/2006/main" xmlns:w14="http://schemas.microsoft.com/office/word/2010/wordml" xmlns:w15="http://schemas.microsoft.com/office/word/2012/wordml" xmlns:w16cex="http://schemas.microsoft.com/office/word/2018/wordml/cex" xmlns:w16cid="http://schemas.microsoft.com/office/word/2016/wordml/cid" xmlns:w16="http://schemas.microsoft.com/office/word/2018/wordml" xmlns:w16sdtdh="http://schemas.microsoft.com/office/word/2020/wordml/sdtdatahash" xmlns:w16se="http://schemas.microsoft.com/office/word/2015/wordml/symex" mc:Ignorable="w14 w15 w16se w16cid w16 w16cex w16sdtdh">
   <w:docDefaults>
     <w:rPrDefault>
       <w:rPr>

</xml_diff>

<commit_message>
Add Call for Research V2 assets and call-for-research page draft.
Update Call for Research Word doc, add V2 docx/pdf, and add call-for-research.html with sitemap entry.
</commit_message>
<xml_diff>
--- a/AT_CallForResearch.docx
+++ b/AT_CallForResearch.docx
@@ -1,6 +1,6 @@
 
 <file path=word/document.xml><?xml version="1.0" encoding="utf-8"?>
-<w:document xmlns:wpc="http://schemas.microsoft.com/office/word/2010/wordprocessingCanvas" xmlns:cx="http://schemas.microsoft.com/office/drawing/2014/chartex" xmlns:cx1="http://schemas.microsoft.com/office/drawing/2015/9/8/chartex" xmlns:cx2="http://schemas.microsoft.com/office/drawing/2015/10/21/chartex" xmlns:cx3="http://schemas.microsoft.com/office/drawing/2016/5/9/chartex" xmlns:cx4="http://schemas.microsoft.com/office/drawing/2016/5/10/chartex" xmlns:cx5="http://schemas.microsoft.com/office/drawing/2016/5/11/chartex" xmlns:cx6="http://schemas.microsoft.com/office/drawing/2016/5/12/chartex" xmlns:cx7="http://schemas.microsoft.com/office/drawing/2016/5/13/chartex" xmlns:cx8="http://schemas.microsoft.com/office/drawing/2016/5/14/chartex" xmlns:mc="http://schemas.openxmlformats.org/markup-compatibility/2006" xmlns:aink="http://schemas.microsoft.com/office/drawing/2016/ink" xmlns:am3d="http://schemas.microsoft.com/office/drawing/2017/model3d" xmlns:o="urn:schemas-microsoft-com:office:office" xmlns:oel="http://schemas.microsoft.com/office/2019/extlst" xmlns:r="http://schemas.openxmlformats.org/officeDocument/2006/relationships" xmlns:m="http://schemas.openxmlformats.org/officeDocument/2006/math" xmlns:v="urn:schemas-microsoft-com:vml" xmlns:wp14="http://schemas.microsoft.com/office/word/2010/wordprocessingDrawing" xmlns:wp="http://schemas.openxmlformats.org/drawingml/2006/wordprocessingDrawing" xmlns:w10="urn:schemas-microsoft-com:office:word" xmlns:w="http://schemas.openxmlformats.org/wordprocessingml/2006/main" xmlns:w14="http://schemas.microsoft.com/office/word/2010/wordml" xmlns:w15="http://schemas.microsoft.com/office/word/2012/wordml" xmlns:w16cex="http://schemas.microsoft.com/office/word/2018/wordml/cex" xmlns:w16cid="http://schemas.microsoft.com/office/word/2016/wordml/cid" xmlns:w16="http://schemas.microsoft.com/office/word/2018/wordml" xmlns:w16sdtdh="http://schemas.microsoft.com/office/word/2020/wordml/sdtdatahash" xmlns:w16se="http://schemas.microsoft.com/office/word/2015/wordml/symex" xmlns:wpg="http://schemas.microsoft.com/office/word/2010/wordprocessingGroup" xmlns:wpi="http://schemas.microsoft.com/office/word/2010/wordprocessingInk" xmlns:wne="http://schemas.microsoft.com/office/word/2006/wordml" xmlns:wps="http://schemas.microsoft.com/office/word/2010/wordprocessingShape" mc:Ignorable="w14 w15 w16se w16cid w16 w16cex w16sdtdh wp14">
+<w:document xmlns:wpc="http://schemas.microsoft.com/office/word/2010/wordprocessingCanvas" xmlns:cx="http://schemas.microsoft.com/office/drawing/2014/chartex" xmlns:cx1="http://schemas.microsoft.com/office/drawing/2015/9/8/chartex" xmlns:cx2="http://schemas.microsoft.com/office/drawing/2015/10/21/chartex" xmlns:cx3="http://schemas.microsoft.com/office/drawing/2016/5/9/chartex" xmlns:cx4="http://schemas.microsoft.com/office/drawing/2016/5/10/chartex" xmlns:cx5="http://schemas.microsoft.com/office/drawing/2016/5/11/chartex" xmlns:cx6="http://schemas.microsoft.com/office/drawing/2016/5/12/chartex" xmlns:cx7="http://schemas.microsoft.com/office/drawing/2016/5/13/chartex" xmlns:cx8="http://schemas.microsoft.com/office/drawing/2016/5/14/chartex" xmlns:mc="http://schemas.openxmlformats.org/markup-compatibility/2006" xmlns:aink="http://schemas.microsoft.com/office/drawing/2016/ink" xmlns:am3d="http://schemas.microsoft.com/office/drawing/2017/model3d" xmlns:o="urn:schemas-microsoft-com:office:office" xmlns:r="http://schemas.openxmlformats.org/officeDocument/2006/relationships" xmlns:m="http://schemas.openxmlformats.org/officeDocument/2006/math" xmlns:v="urn:schemas-microsoft-com:vml" xmlns:wp14="http://schemas.microsoft.com/office/word/2010/wordprocessingDrawing" xmlns:wp="http://schemas.openxmlformats.org/drawingml/2006/wordprocessingDrawing" xmlns:w10="urn:schemas-microsoft-com:office:word" xmlns:w="http://schemas.openxmlformats.org/wordprocessingml/2006/main" xmlns:w14="http://schemas.microsoft.com/office/word/2010/wordml" xmlns:w15="http://schemas.microsoft.com/office/word/2012/wordml" xmlns:w16cid="http://schemas.microsoft.com/office/word/2016/wordml/cid" xmlns:w16se="http://schemas.microsoft.com/office/word/2015/wordml/symex" xmlns:wpg="http://schemas.microsoft.com/office/word/2010/wordprocessingGroup" xmlns:wpi="http://schemas.microsoft.com/office/word/2010/wordprocessingInk" xmlns:wne="http://schemas.microsoft.com/office/word/2006/wordml" xmlns:wps="http://schemas.microsoft.com/office/word/2010/wordprocessingShape" mc:Ignorable="w14 w15 w16se w16cid wp14">
   <w:body>
     <w:p>
       <w:pPr>
@@ -16,7 +16,21 @@
           <w:rFonts w:eastAsia="Times New Roman"/>
           <w:color w:val="auto"/>
         </w:rPr>
-        <w:t xml:space="preserve">Help Validate Chronoacupuncture for Jet Lag </w:t>
+        <w:t xml:space="preserve">Help Validate </w:t>
+      </w:r>
+      <w:r>
+        <w:rPr>
+          <w:rFonts w:eastAsia="Times New Roman"/>
+          <w:color w:val="auto"/>
+        </w:rPr>
+        <w:t>Timed Acupressure</w:t>
+      </w:r>
+      <w:r>
+        <w:rPr>
+          <w:rFonts w:eastAsia="Times New Roman"/>
+          <w:color w:val="auto"/>
+        </w:rPr>
+        <w:t xml:space="preserve"> for Jet Lag </w:t>
       </w:r>
     </w:p>
     <w:p>
@@ -2782,24 +2796,10 @@
         <w:t xml:space="preserve">app is entirely free with no </w:t>
       </w:r>
       <w:r>
-        <w:t xml:space="preserve">add-ons, </w:t>
-      </w:r>
-      <w:proofErr w:type="gramStart"/>
-      <w:r>
-        <w:t>upgrades</w:t>
-      </w:r>
-      <w:proofErr w:type="gramEnd"/>
-      <w:r>
-        <w:t xml:space="preserve"> or </w:t>
-      </w:r>
-      <w:r>
-        <w:t>advertisements. As an incentive, participants who use the app for a valid journey and complete the survey will enjoy free lifetime access</w:t>
-      </w:r>
-      <w:r>
-        <w:t xml:space="preserve"> when the app is officially released</w:t>
-      </w:r>
-      <w:r>
-        <w:t xml:space="preserve">. </w:t>
+        <w:t xml:space="preserve">add-ons, upgrades or </w:t>
+      </w:r>
+      <w:r>
+        <w:t xml:space="preserve">advertisements. </w:t>
       </w:r>
     </w:p>
     <w:p>
@@ -2827,8 +2827,24 @@
         <w:t xml:space="preserve"> us</w:t>
       </w:r>
       <w:r>
-        <w:t xml:space="preserve"> info@jetlagpro.com.</w:t>
-      </w:r>
+        <w:t xml:space="preserve"> </w:t>
+      </w:r>
+      <w:hyperlink r:id="rId9" w:history="1">
+        <w:r>
+          <w:rPr>
+            <w:rStyle w:val="Hyperlink"/>
+          </w:rPr>
+          <w:t>info@jetlagpro.com</w:t>
+        </w:r>
+      </w:hyperlink>
+      <w:r>
+        <w:t>.</w:t>
+      </w:r>
+    </w:p>
+    <w:p>
+      <w:pPr>
+        <w:divId w:val="1808039875"/>
+      </w:pPr>
     </w:p>
     <w:p>
       <w:pPr>
@@ -2870,7 +2886,7 @@
                     <pic:cNvPicPr/>
                   </pic:nvPicPr>
                   <pic:blipFill>
-                    <a:blip r:embed="rId9" cstate="print">
+                    <a:blip r:embed="rId10" cstate="print">
                       <a:extLst>
                         <a:ext uri="{28A0092B-C50C-407E-A947-70E740481C1C}">
                           <a14:useLocalDpi xmlns:a14="http://schemas.microsoft.com/office/drawing/2010/main" val="0"/>
@@ -3004,7 +3020,7 @@
                     <pic:cNvPicPr/>
                   </pic:nvPicPr>
                   <pic:blipFill>
-                    <a:blip r:embed="rId10" cstate="print">
+                    <a:blip r:embed="rId11" cstate="print">
                       <a:extLst>
                         <a:ext uri="{28A0092B-C50C-407E-A947-70E740481C1C}">
                           <a14:useLocalDpi xmlns:a14="http://schemas.microsoft.com/office/drawing/2010/main" val="0"/>
@@ -3145,7 +3161,13 @@
         <w:t>D</w:t>
       </w:r>
       <w:r>
-        <w:t xml:space="preserve">oes chronoacupuncture </w:t>
+        <w:t xml:space="preserve">oes </w:t>
+      </w:r>
+      <w:r>
+        <w:t>timed acupressure</w:t>
+      </w:r>
+      <w:r>
+        <w:t xml:space="preserve"> </w:t>
       </w:r>
       <w:r>
         <w:t>(</w:t>
@@ -3278,40 +3300,36 @@
         <w:t xml:space="preserve">demographics and environmental factors. </w:t>
       </w:r>
       <w:r>
-        <w:t>In this study, these</w:t>
-      </w:r>
-      <w:r>
-        <w:t xml:space="preserve"> uncontrolled variables </w:t>
-      </w:r>
-      <w:r>
-        <w:t>do</w:t>
-      </w:r>
-      <w:r>
-        <w:t xml:space="preserve"> not undermine validity because the expected sample size of</w:t>
+        <w:t xml:space="preserve">This observational study accepts </w:t>
+      </w:r>
+      <w:r>
+        <w:t>th</w:t>
+      </w:r>
+      <w:r>
+        <w:t>o</w:t>
+      </w:r>
+      <w:r>
+        <w:t>se</w:t>
       </w:r>
       <w:r>
         <w:t xml:space="preserve"> </w:t>
       </w:r>
       <w:r>
-        <w:t>point u</w:t>
-      </w:r>
-      <w:r>
-        <w:t xml:space="preserve">sage </w:t>
-      </w:r>
-      <w:r>
-        <w:t xml:space="preserve">data and </w:t>
-      </w:r>
-      <w:r>
-        <w:t xml:space="preserve">survey results </w:t>
-      </w:r>
-      <w:r>
-        <w:t xml:space="preserve">will provide sufficient statistical power to detect meaningful effects. </w:t>
+        <w:t xml:space="preserve">limits: </w:t>
+      </w:r>
+      <w:r>
+        <w:t xml:space="preserve">uncontrolled variables </w:t>
+      </w:r>
+      <w:r>
+        <w:t xml:space="preserve">do not prevent us from describing associations between point use and reported symptoms in real-world travelers. We aim to collect data from roughly 500 qualifying trips so patterns can be described with reasonable precision.  </w:t>
       </w:r>
     </w:p>
     <w:p>
       <w:pPr>
         <w:divId w:val="1808039875"/>
       </w:pPr>
+      <w:bookmarkStart w:id="2" w:name="_GoBack"/>
+      <w:bookmarkEnd w:id="2"/>
       <w:r>
         <w:rPr>
           <w:rFonts w:eastAsia="Times New Roman"/>
@@ -3354,7 +3372,7 @@
       <w:r>
         <w:t xml:space="preserve">Waterhouse, J., Reilly, T., Atkinson, G., &amp; Edwards, B. (2007). Jet lag: Trends and coping strategies. The Lancet, 369(9567), 1117–1129. </w:t>
       </w:r>
-      <w:hyperlink r:id="rId11" w:tgtFrame="_blank" w:history="1">
+      <w:hyperlink r:id="rId12" w:tgtFrame="_blank" w:history="1">
         <w:r>
           <w:rPr>
             <w:rStyle w:val="Hyperlink"/>
@@ -3382,19 +3400,11 @@
           <w:color w:val="000000" w:themeColor="text1"/>
         </w:rPr>
       </w:pPr>
-      <w:proofErr w:type="spellStart"/>
       <w:r>
         <w:rPr>
           <w:color w:val="000000" w:themeColor="text1"/>
         </w:rPr>
-        <w:t>Khoe</w:t>
-      </w:r>
-      <w:proofErr w:type="spellEnd"/>
-      <w:r>
-        <w:rPr>
-          <w:color w:val="000000" w:themeColor="text1"/>
-        </w:rPr>
-        <w:t>, W.H. (1978). Treatment of jet lag syndrome by acupuncture. American Journal of Acupuncture, 6(2), 135–139.</w:t>
+        <w:t>Khoe, W.H. (1978). Treatment of jet lag syndrome by acupuncture. American Journal of Acupuncture, 6(2), 135–139.</w:t>
       </w:r>
     </w:p>
     <w:p>
@@ -3418,7 +3428,7 @@
         </w:rPr>
         <w:t xml:space="preserve">Amaro, J. (2001). Time Travel: Contemporary Applications for Jet Lag from Ancient Principles. Acupuncture Today, October 2001. </w:t>
       </w:r>
-      <w:hyperlink r:id="rId12" w:tgtFrame="_blank" w:history="1">
+      <w:hyperlink r:id="rId13" w:tgtFrame="_blank" w:history="1">
         <w:r>
           <w:rPr>
             <w:rStyle w:val="Hyperlink"/>
@@ -3455,31 +3465,16 @@
         </w:rPr>
         <w:t xml:space="preserve">PLoS Biology, 20(3), e3001567. </w:t>
       </w:r>
-      <w:r>
-        <w:fldChar w:fldCharType="begin"/>
-      </w:r>
-      <w:r>
-        <w:instrText>HYPERLINK "https://doi.org/10.1371/journal.pbio.3001567" \t "_blank"</w:instrText>
-      </w:r>
-      <w:r>
-        <w:fldChar w:fldCharType="separate"/>
-      </w:r>
-      <w:r>
-        <w:rPr>
-          <w:rStyle w:val="Hyperlink"/>
-          <w:color w:val="000000" w:themeColor="text1"/>
-          <w:lang w:val="es-MX"/>
-        </w:rPr>
-        <w:t>https://doi.org/10.1371/journal.pbio.3001567</w:t>
-      </w:r>
-      <w:r>
-        <w:rPr>
-          <w:rStyle w:val="Hyperlink"/>
-          <w:color w:val="000000" w:themeColor="text1"/>
-          <w:lang w:val="es-MX"/>
-        </w:rPr>
-        <w:fldChar w:fldCharType="end"/>
-      </w:r>
+      <w:hyperlink r:id="rId14" w:tgtFrame="_blank" w:history="1">
+        <w:r>
+          <w:rPr>
+            <w:rStyle w:val="Hyperlink"/>
+            <w:color w:val="000000" w:themeColor="text1"/>
+            <w:lang w:val="es-MX"/>
+          </w:rPr>
+          <w:t>https://doi.org/10.1371/journal.pbio.3001567</w:t>
+        </w:r>
+      </w:hyperlink>
     </w:p>
     <w:p>
       <w:pPr>
@@ -3507,7 +3502,7 @@
         </w:rPr>
         <w:t xml:space="preserve">The mammalian circadian timing system and the suprachiasmatic nucleus as its pacemaker. Biology, 8(1), 13. </w:t>
       </w:r>
-      <w:hyperlink r:id="rId13" w:tgtFrame="_blank" w:history="1">
+      <w:hyperlink r:id="rId15" w:tgtFrame="_blank" w:history="1">
         <w:r>
           <w:rPr>
             <w:rStyle w:val="Hyperlink"/>
@@ -3544,7 +3539,7 @@
         </w:rPr>
         <w:t xml:space="preserve">, G.K., &amp; FitzGerald, G.A. (2010). Circadian clocks and vascular function. Circulation Research, 106(5), 833-841. </w:t>
       </w:r>
-      <w:hyperlink r:id="rId14" w:tgtFrame="_blank" w:history="1">
+      <w:hyperlink r:id="rId16" w:tgtFrame="_blank" w:history="1">
         <w:r>
           <w:rPr>
             <w:rStyle w:val="Hyperlink"/>
@@ -3573,7 +3568,7 @@
         </w:rPr>
         <w:t xml:space="preserve">Hastings, M. H., et al. (2003). A clockwork web: circadian timing in brain and periphery. Nature Reviews Neuroscience, 4(8), 649–661. </w:t>
       </w:r>
-      <w:hyperlink r:id="rId15" w:tgtFrame="_blank" w:history="1">
+      <w:hyperlink r:id="rId17" w:tgtFrame="_blank" w:history="1">
         <w:r>
           <w:rPr>
             <w:rStyle w:val="Hyperlink"/>
@@ -3652,7 +3647,7 @@
         </w:rPr>
         <w:t xml:space="preserve">, 3, e03674. </w:t>
       </w:r>
-      <w:hyperlink r:id="rId16" w:tgtFrame="_blank" w:history="1">
+      <w:hyperlink r:id="rId18" w:tgtFrame="_blank" w:history="1">
         <w:r>
           <w:rPr>
             <w:rStyle w:val="Hyperlink"/>
@@ -3689,7 +3684,7 @@
         </w:rPr>
         <w:t xml:space="preserve">, I., &amp; Oster, H. (2019). Differentiating external zeitgeber impact on peripheral circadian clock resetting. Scientific Reports, 9, 20114. </w:t>
       </w:r>
-      <w:hyperlink r:id="rId17" w:tgtFrame="_blank" w:history="1">
+      <w:hyperlink r:id="rId19" w:tgtFrame="_blank" w:history="1">
         <w:r>
           <w:rPr>
             <w:rStyle w:val="Hyperlink"/>
@@ -3718,7 +3713,7 @@
         </w:rPr>
         <w:t xml:space="preserve">Wu, J., &amp; Zhao, Z. (2024). Acupuncture in circadian rhythm sleep–wake disorders and its potential neurochemical mechanisms. Frontiers in Neuroscience, 18, 1346635. </w:t>
       </w:r>
-      <w:hyperlink r:id="rId18" w:tgtFrame="_blank" w:history="1">
+      <w:hyperlink r:id="rId20" w:tgtFrame="_blank" w:history="1">
         <w:r>
           <w:rPr>
             <w:rStyle w:val="Hyperlink"/>
@@ -3755,7 +3750,7 @@
 </file>
 
 <file path=word/numbering.xml><?xml version="1.0" encoding="utf-8"?>
-<w:numbering xmlns:wpc="http://schemas.microsoft.com/office/word/2010/wordprocessingCanvas" xmlns:cx="http://schemas.microsoft.com/office/drawing/2014/chartex" xmlns:cx1="http://schemas.microsoft.com/office/drawing/2015/9/8/chartex" xmlns:cx2="http://schemas.microsoft.com/office/drawing/2015/10/21/chartex" xmlns:cx3="http://schemas.microsoft.com/office/drawing/2016/5/9/chartex" xmlns:cx4="http://schemas.microsoft.com/office/drawing/2016/5/10/chartex" xmlns:cx5="http://schemas.microsoft.com/office/drawing/2016/5/11/chartex" xmlns:cx6="http://schemas.microsoft.com/office/drawing/2016/5/12/chartex" xmlns:cx7="http://schemas.microsoft.com/office/drawing/2016/5/13/chartex" xmlns:cx8="http://schemas.microsoft.com/office/drawing/2016/5/14/chartex" xmlns:mc="http://schemas.openxmlformats.org/markup-compatibility/2006" xmlns:aink="http://schemas.microsoft.com/office/drawing/2016/ink" xmlns:am3d="http://schemas.microsoft.com/office/drawing/2017/model3d" xmlns:o="urn:schemas-microsoft-com:office:office" xmlns:oel="http://schemas.microsoft.com/office/2019/extlst" xmlns:r="http://schemas.openxmlformats.org/officeDocument/2006/relationships" xmlns:m="http://schemas.openxmlformats.org/officeDocument/2006/math" xmlns:v="urn:schemas-microsoft-com:vml" xmlns:wp14="http://schemas.microsoft.com/office/word/2010/wordprocessingDrawing" xmlns:wp="http://schemas.openxmlformats.org/drawingml/2006/wordprocessingDrawing" xmlns:w10="urn:schemas-microsoft-com:office:word" xmlns:w="http://schemas.openxmlformats.org/wordprocessingml/2006/main" xmlns:w14="http://schemas.microsoft.com/office/word/2010/wordml" xmlns:w15="http://schemas.microsoft.com/office/word/2012/wordml" xmlns:w16cex="http://schemas.microsoft.com/office/word/2018/wordml/cex" xmlns:w16cid="http://schemas.microsoft.com/office/word/2016/wordml/cid" xmlns:w16="http://schemas.microsoft.com/office/word/2018/wordml" xmlns:w16sdtdh="http://schemas.microsoft.com/office/word/2020/wordml/sdtdatahash" xmlns:w16se="http://schemas.microsoft.com/office/word/2015/wordml/symex" xmlns:wpg="http://schemas.microsoft.com/office/word/2010/wordprocessingGroup" xmlns:wpi="http://schemas.microsoft.com/office/word/2010/wordprocessingInk" xmlns:wne="http://schemas.microsoft.com/office/word/2006/wordml" xmlns:wps="http://schemas.microsoft.com/office/word/2010/wordprocessingShape" mc:Ignorable="w14 w15 w16se w16cid w16 w16cex w16sdtdh wp14">
+<w:numbering xmlns:wpc="http://schemas.microsoft.com/office/word/2010/wordprocessingCanvas" xmlns:cx="http://schemas.microsoft.com/office/drawing/2014/chartex" xmlns:cx1="http://schemas.microsoft.com/office/drawing/2015/9/8/chartex" xmlns:cx2="http://schemas.microsoft.com/office/drawing/2015/10/21/chartex" xmlns:cx3="http://schemas.microsoft.com/office/drawing/2016/5/9/chartex" xmlns:cx4="http://schemas.microsoft.com/office/drawing/2016/5/10/chartex" xmlns:cx5="http://schemas.microsoft.com/office/drawing/2016/5/11/chartex" xmlns:cx6="http://schemas.microsoft.com/office/drawing/2016/5/12/chartex" xmlns:cx7="http://schemas.microsoft.com/office/drawing/2016/5/13/chartex" xmlns:cx8="http://schemas.microsoft.com/office/drawing/2016/5/14/chartex" xmlns:mc="http://schemas.openxmlformats.org/markup-compatibility/2006" xmlns:aink="http://schemas.microsoft.com/office/drawing/2016/ink" xmlns:am3d="http://schemas.microsoft.com/office/drawing/2017/model3d" xmlns:o="urn:schemas-microsoft-com:office:office" xmlns:r="http://schemas.openxmlformats.org/officeDocument/2006/relationships" xmlns:m="http://schemas.openxmlformats.org/officeDocument/2006/math" xmlns:v="urn:schemas-microsoft-com:vml" xmlns:wp14="http://schemas.microsoft.com/office/word/2010/wordprocessingDrawing" xmlns:wp="http://schemas.openxmlformats.org/drawingml/2006/wordprocessingDrawing" xmlns:w10="urn:schemas-microsoft-com:office:word" xmlns:w="http://schemas.openxmlformats.org/wordprocessingml/2006/main" xmlns:w14="http://schemas.microsoft.com/office/word/2010/wordml" xmlns:w15="http://schemas.microsoft.com/office/word/2012/wordml" xmlns:w16cid="http://schemas.microsoft.com/office/word/2016/wordml/cid" xmlns:w16se="http://schemas.microsoft.com/office/word/2015/wordml/symex" xmlns:wpg="http://schemas.microsoft.com/office/word/2010/wordprocessingGroup" xmlns:wpi="http://schemas.microsoft.com/office/word/2010/wordprocessingInk" xmlns:wne="http://schemas.microsoft.com/office/word/2006/wordml" xmlns:wps="http://schemas.microsoft.com/office/word/2010/wordprocessingShape" mc:Ignorable="w14 w15 w16se w16cid wp14">
   <w:abstractNum w:abstractNumId="0" w15:restartNumberingAfterBreak="0">
     <w:nsid w:val="01291F70"/>
     <w:multiLevelType w:val="hybridMultilevel"/>
@@ -5068,41 +5063,41 @@
       </w:rPr>
     </w:lvl>
   </w:abstractNum>
-  <w:num w:numId="1" w16cid:durableId="10768411">
+  <w:num w:numId="1">
     <w:abstractNumId w:val="5"/>
   </w:num>
-  <w:num w:numId="2" w16cid:durableId="1498112529">
+  <w:num w:numId="2">
     <w:abstractNumId w:val="8"/>
   </w:num>
-  <w:num w:numId="3" w16cid:durableId="594828661">
+  <w:num w:numId="3">
     <w:abstractNumId w:val="6"/>
   </w:num>
-  <w:num w:numId="4" w16cid:durableId="1829705971">
+  <w:num w:numId="4">
     <w:abstractNumId w:val="1"/>
   </w:num>
-  <w:num w:numId="5" w16cid:durableId="1931113277">
+  <w:num w:numId="5">
     <w:abstractNumId w:val="3"/>
   </w:num>
-  <w:num w:numId="6" w16cid:durableId="1305159463">
+  <w:num w:numId="6">
     <w:abstractNumId w:val="2"/>
   </w:num>
-  <w:num w:numId="7" w16cid:durableId="690179744">
+  <w:num w:numId="7">
     <w:abstractNumId w:val="7"/>
   </w:num>
-  <w:num w:numId="8" w16cid:durableId="133184558">
+  <w:num w:numId="8">
     <w:abstractNumId w:val="0"/>
   </w:num>
-  <w:num w:numId="9" w16cid:durableId="479150323">
+  <w:num w:numId="9">
     <w:abstractNumId w:val="4"/>
   </w:num>
-  <w:num w:numId="10" w16cid:durableId="181282531">
+  <w:num w:numId="10">
     <w:abstractNumId w:val="9"/>
   </w:num>
 </w:numbering>
 </file>
 
 <file path=word/styles.xml><?xml version="1.0" encoding="utf-8"?>
-<w:styles xmlns:mc="http://schemas.openxmlformats.org/markup-compatibility/2006" xmlns:r="http://schemas.openxmlformats.org/officeDocument/2006/relationships" xmlns:w="http://schemas.openxmlformats.org/wordprocessingml/2006/main" xmlns:w14="http://schemas.microsoft.com/office/word/2010/wordml" xmlns:w15="http://schemas.microsoft.com/office/word/2012/wordml" xmlns:w16cex="http://schemas.microsoft.com/office/word/2018/wordml/cex" xmlns:w16cid="http://schemas.microsoft.com/office/word/2016/wordml/cid" xmlns:w16="http://schemas.microsoft.com/office/word/2018/wordml" xmlns:w16sdtdh="http://schemas.microsoft.com/office/word/2020/wordml/sdtdatahash" xmlns:w16se="http://schemas.microsoft.com/office/word/2015/wordml/symex" mc:Ignorable="w14 w15 w16se w16cid w16 w16cex w16sdtdh">
+<w:styles xmlns:mc="http://schemas.openxmlformats.org/markup-compatibility/2006" xmlns:r="http://schemas.openxmlformats.org/officeDocument/2006/relationships" xmlns:w="http://schemas.openxmlformats.org/wordprocessingml/2006/main" xmlns:w14="http://schemas.microsoft.com/office/word/2010/wordml" xmlns:w15="http://schemas.microsoft.com/office/word/2012/wordml" xmlns:w16cid="http://schemas.microsoft.com/office/word/2016/wordml/cid" xmlns:w16se="http://schemas.microsoft.com/office/word/2015/wordml/symex" mc:Ignorable="w14 w15 w16se w16cid">
   <w:docDefaults>
     <w:rPrDefault>
       <w:rPr>
@@ -5112,7 +5107,7 @@
     </w:rPrDefault>
     <w:pPrDefault/>
   </w:docDefaults>
-  <w:latentStyles w:defLockedState="0" w:defUIPriority="99" w:defSemiHidden="0" w:defUnhideWhenUsed="0" w:defQFormat="0" w:count="376">
+  <w:latentStyles w:defLockedState="0" w:defUIPriority="99" w:defSemiHidden="0" w:defUnhideWhenUsed="0" w:defQFormat="0" w:count="375">
     <w:lsdException w:name="Normal" w:uiPriority="0" w:qFormat="1"/>
     <w:lsdException w:name="heading 1" w:uiPriority="9" w:qFormat="1"/>
     <w:lsdException w:name="heading 2" w:uiPriority="9" w:qFormat="1"/>
@@ -5488,7 +5483,6 @@
     <w:lsdException w:name="Smart Hyperlink" w:semiHidden="1" w:unhideWhenUsed="1"/>
     <w:lsdException w:name="Hashtag" w:semiHidden="1" w:unhideWhenUsed="1"/>
     <w:lsdException w:name="Unresolved Mention" w:semiHidden="1" w:unhideWhenUsed="1"/>
-    <w:lsdException w:name="Smart Link" w:semiHidden="1" w:unhideWhenUsed="1"/>
   </w:latentStyles>
   <w:style w:type="paragraph" w:default="1" w:styleId="Normal">
     <w:name w:val="Normal"/>
@@ -6193,7 +6187,7 @@
 </file>
 
 <file path=customXml/itemProps1.xml><?xml version="1.0" encoding="utf-8"?>
-<ds:datastoreItem xmlns:ds="http://schemas.openxmlformats.org/officeDocument/2006/customXml" ds:itemID="{9576F0C7-627B-420C-8FC3-CBBC76ED2089}">
+<ds:datastoreItem xmlns:ds="http://schemas.openxmlformats.org/officeDocument/2006/customXml" ds:itemID="{861170C8-E8D0-4244-A088-897C0650BC11}">
   <ds:schemaRefs>
     <ds:schemaRef ds:uri="http://schemas.openxmlformats.org/officeDocument/2006/bibliography"/>
   </ds:schemaRefs>

</xml_diff>